<commit_message>
Bereinigte Schreibprojkete, passe DOCX-Export und Vorlage an
</commit_message>
<xml_diff>
--- a/Vorlage/Normseite.docx
+++ b/Vorlage/Normseite.docx
@@ -371,7 +371,7 @@
       <w:ind w:right="360"/>
     </w:pPr>
     <w:r>
-      <w:t>Sebastian Sukstorf</w:t>
+      <w:t>Sebastian Fischer</w:t>
     </w:r>
     <w:r>
       <w:tab/>
@@ -461,7 +461,7 @@
       <w:ind w:right="360"/>
     </w:pPr>
     <w:r>
-      <w:t>Sebastian Sukstorf</w:t>
+      <w:t>Sebastian Fischer</w:t>
     </w:r>
     <w:r>
       <w:tab/>

</xml_diff>